<commit_message>
docs: actualizar README y Manual Word - eliminar seccion imagen, agregar selector plantilla a mermas
- Eliminar Paso 5 (Imagen Adjunta) del README y Word
- Renumerar pasos: Commercial Invoice 5 pasos, Mermas 6 pasos
- Agregar Paso 2 selector de plantilla en modulo Mermas
- Eliminar FAQ sobre imagen pegada
- Regenerar Manual_de_Usuario_InvoiceConverter.docx
</commit_message>
<xml_diff>
--- a/Manual_de_Usuario_InvoiceConverter.docx
+++ b/Manual_de_Usuario_InvoiceConverter.docx
@@ -1001,92 +1001,7 @@
           <w:color w:val="EB5F0A"/>
           <w:sz w:val="28"/>
         </w:rPr>
-        <w:t>Paso 5: Adjuntar imagen (opcional)</w:t>
-      </w:r>
-    </w:p>
-    <w:p>
-      <w:r>
-        <w:rPr>
-          <w:rFonts w:ascii="Calibri" w:hAnsi="Calibri"/>
-          <w:color w:val="333333"/>
-          <w:sz w:val="20"/>
-        </w:rPr>
-        <w:t>En la sección "Imagen Adjunta" puedes pegar una imagen (por ejemplo, un sello o firma):</w:t>
-      </w:r>
-    </w:p>
-    <w:p>
-      <w:pPr>
-        <w:pStyle w:val="ListBullet"/>
-      </w:pPr>
-      <w:r>
-        <w:rPr>
-          <w:rFonts w:ascii="Calibri" w:hAnsi="Calibri"/>
-          <w:color w:val="333333"/>
-          <w:sz w:val="20"/>
-        </w:rPr>
-        <w:t>Copia la imagen en tu portapapeles (Ctrl+C sobre la imagen)</w:t>
-      </w:r>
-    </w:p>
-    <w:p>
-      <w:pPr>
-        <w:pStyle w:val="ListBullet"/>
-      </w:pPr>
-      <w:r>
-        <w:rPr>
-          <w:rFonts w:ascii="Calibri" w:hAnsi="Calibri"/>
-          <w:color w:val="333333"/>
-          <w:sz w:val="20"/>
-        </w:rPr>
-        <w:t>Haz clic en el área que dice "Clic aquí y Ctrl+V para pegar imagen"</w:t>
-      </w:r>
-    </w:p>
-    <w:p>
-      <w:pPr>
-        <w:pStyle w:val="ListBullet"/>
-      </w:pPr>
-      <w:r>
-        <w:rPr>
-          <w:rFonts w:ascii="Calibri" w:hAnsi="Calibri"/>
-          <w:color w:val="333333"/>
-          <w:sz w:val="20"/>
-        </w:rPr>
-        <w:t>Presiona Ctrl+V</w:t>
-      </w:r>
-    </w:p>
-    <w:p>
-      <w:pPr>
-        <w:pStyle w:val="ListBullet"/>
-      </w:pPr>
-      <w:r>
-        <w:rPr>
-          <w:rFonts w:ascii="Calibri" w:hAnsi="Calibri"/>
-          <w:color w:val="333333"/>
-          <w:sz w:val="20"/>
-        </w:rPr>
-        <w:t>Ajusta el tamaño con el control deslizante si es necesario</w:t>
-      </w:r>
-    </w:p>
-    <w:p>
-      <w:r>
-        <w:rPr>
-          <w:rFonts w:ascii="Calibri" w:hAnsi="Calibri"/>
-          <w:i/>
-          <w:color w:val="B4A28D"/>
-          <w:sz w:val="18"/>
-        </w:rPr>
-        <w:t>💡 La imagen se incrustará en la parte inferior de cada página del PDF.</w:t>
-      </w:r>
-    </w:p>
-    <w:p>
-      <w:pPr>
-        <w:pStyle w:val="Heading2"/>
-      </w:pPr>
-      <w:r>
-        <w:rPr>
-          <w:color w:val="EB5F0A"/>
-          <w:sz w:val="28"/>
-        </w:rPr>
-        <w:t>Paso 6: Descargar</w:t>
+        <w:t>Paso 5: Descargar</w:t>
       </w:r>
     </w:p>
     <w:p>
@@ -1213,7 +1128,29 @@
           <w:color w:val="EB5F0A"/>
           <w:sz w:val="28"/>
         </w:rPr>
-        <w:t>Paso 2: Cargar la factura</w:t>
+        <w:t>Paso 2: Seleccionar la plantilla</w:t>
+      </w:r>
+    </w:p>
+    <w:p>
+      <w:r>
+        <w:rPr>
+          <w:rFonts w:ascii="Calibri" w:hAnsi="Calibri"/>
+          <w:color w:val="333333"/>
+          <w:sz w:val="20"/>
+        </w:rPr>
+        <w:t>Al cargar el PDF verás un selector de PLANTILLA en la parte superior (igual que en Commercial Invoice). Selecciona la plantilla correcta según la empresa de la factura (Empresas Aquachile o Los Fiordos). Las operaciones del perfil seleccionado se aplican al generar el PDF de merma.</w:t>
+      </w:r>
+    </w:p>
+    <w:p>
+      <w:pPr>
+        <w:pStyle w:val="Heading2"/>
+      </w:pPr>
+      <w:r>
+        <w:rPr>
+          <w:color w:val="EB5F0A"/>
+          <w:sz w:val="28"/>
+        </w:rPr>
+        <w:t>Paso 3: Cargar la factura</w:t>
       </w:r>
     </w:p>
     <w:p>
@@ -1235,7 +1172,7 @@
           <w:color w:val="EB5F0A"/>
           <w:sz w:val="28"/>
         </w:rPr>
-        <w:t>Paso 3: Modificar las cajas</w:t>
+        <w:t>Paso 4: Modificar las cajas</w:t>
       </w:r>
     </w:p>
     <w:p>
@@ -1317,7 +1254,29 @@
           <w:color w:val="EB5F0A"/>
           <w:sz w:val="28"/>
         </w:rPr>
-        <w:t>Paso 4: Generar PDF</w:t>
+        <w:t>Paso 5: Vista previa (opcional)</w:t>
+      </w:r>
+    </w:p>
+    <w:p>
+      <w:r>
+        <w:rPr>
+          <w:rFonts w:ascii="Calibri" w:hAnsi="Calibri"/>
+          <w:color w:val="333333"/>
+          <w:sz w:val="20"/>
+        </w:rPr>
+        <w:t>Haz clic en "🔍 Mostrar Preview" para ver cómo quedará el PDF final en tiempo real.</w:t>
+      </w:r>
+    </w:p>
+    <w:p>
+      <w:pPr>
+        <w:pStyle w:val="Heading2"/>
+      </w:pPr>
+      <w:r>
+        <w:rPr>
+          <w:color w:val="EB5F0A"/>
+          <w:sz w:val="28"/>
+        </w:rPr>
+        <w:t>Paso 6: Generar PDF</w:t>
       </w:r>
     </w:p>
     <w:p>
@@ -3032,30 +2991,6 @@
           <w:color w:val="445563"/>
           <w:sz w:val="20"/>
         </w:rPr>
-        <w:t>❓ ¿Qué pasa con la imagen pegada al cerrar la página?</w:t>
-      </w:r>
-    </w:p>
-    <w:p>
-      <w:pPr>
-        <w:spacing w:after="160"/>
-      </w:pPr>
-      <w:r>
-        <w:rPr>
-          <w:rFonts w:ascii="Calibri" w:hAnsi="Calibri"/>
-          <w:color w:val="333333"/>
-          <w:sz w:val="20"/>
-        </w:rPr>
-        <w:t>La imagen se pierde al cerrar o recargar la página. Debes pegarla nuevamente cada vez que abras la aplicación.</w:t>
-      </w:r>
-    </w:p>
-    <w:p>
-      <w:r>
-        <w:rPr>
-          <w:rFonts w:ascii="Calibri" w:hAnsi="Calibri"/>
-          <w:b/>
-          <w:color w:val="445563"/>
-          <w:sz w:val="20"/>
-        </w:rPr>
         <w:t>❓ ¿El módulo de Mermas aplica también las transformaciones de Commercial Invoice?</w:t>
       </w:r>
     </w:p>

</xml_diff>